<commit_message>
Fixed test for doc_editor.py
</commit_message>
<xml_diff>
--- a/tests_python/TestFiles/(Test)Doc1.docx
+++ b/tests_python/TestFiles/(Test)Doc1.docx
@@ -7,7 +7,13 @@
         <w:t xml:space="preserve">Hello my name is </w:t>
       </w:r>
       <w:r>
-        <w:t>&lt;&lt;Name&gt;&gt;</w:t>
+        <w:t>${</w:t>
+      </w:r>
+      <w:r>
+        <w:t>Name</w:t>
+      </w:r>
+      <w:r>
+        <w:t>}</w:t>
       </w:r>
       <w:r>
         <w:t>,</w:t>
@@ -19,7 +25,13 @@
         <w:t xml:space="preserve">I am </w:t>
       </w:r>
       <w:r>
-        <w:t>&lt;&lt;Age&gt;&gt;</w:t>
+        <w:t>${</w:t>
+      </w:r>
+      <w:r>
+        <w:t>Age</w:t>
+      </w:r>
+      <w:r>
+        <w:t>}</w:t>
       </w:r>
       <w:r>
         <w:t xml:space="preserve"> years old</w:t>
@@ -30,10 +42,26 @@
     </w:p>
     <w:p>
       <w:r>
-        <w:t>My favorite hobby is &lt;&lt;Hobby&gt;&gt;.</w:t>
+        <w:t xml:space="preserve">My favorite hobby is </w:t>
+      </w:r>
+      <w:r>
+        <w:t>${</w:t>
+      </w:r>
+      <w:r>
+        <w:t>Hobby</w:t>
+      </w:r>
+      <w:r>
+        <w:t>}</w:t>
+      </w:r>
+      <w:r>
+        <w:t>.</w:t>
       </w:r>
     </w:p>
-    <w:p/>
+    <w:p>
+      <w:r>
+        <w:t>&lt;test&gt;Test block&lt;/test&gt;</w:t>
+      </w:r>
+    </w:p>
     <w:tbl>
       <w:tblPr>
         <w:tblStyle w:val="TableGrid"/>

</xml_diff>